<commit_message>
Preserve the reviewed Word CV and its citation count
</commit_message>
<xml_diff>
--- a/data/cv_zheliu_hku.docx
+++ b/data/cv_zheliu_hku.docx
@@ -1,6 +1,6 @@
 
 <file path=word/document.xml><?xml version="1.0" encoding="utf-8"?>
-<w:document xmlns:wpc="http://schemas.microsoft.com/office/word/2010/wordprocessingCanvas" xmlns:cx="http://schemas.microsoft.com/office/drawing/2014/chartex" xmlns:cx1="http://schemas.microsoft.com/office/drawing/2015/9/8/chartex" xmlns:cx2="http://schemas.microsoft.com/office/drawing/2015/10/21/chartex" xmlns:cx3="http://schemas.microsoft.com/office/drawing/2016/5/9/chartex" xmlns:cx4="http://schemas.microsoft.com/office/drawing/2016/5/10/chartex" xmlns:cx5="http://schemas.microsoft.com/office/drawing/2016/5/11/chartex" xmlns:cx6="http://schemas.microsoft.com/office/drawing/2016/5/12/chartex" xmlns:cx7="http://schemas.microsoft.com/office/drawing/2016/5/13/chartex" xmlns:cx8="http://schemas.microsoft.com/office/drawing/2016/5/14/chartex" xmlns:mc="http://schemas.openxmlformats.org/markup-compatibility/2006" xmlns:aink="http://schemas.microsoft.com/office/drawing/2016/ink" xmlns:am3d="http://schemas.microsoft.com/office/drawing/2017/model3d" xmlns:o="urn:schemas-microsoft-com:office:office" xmlns:oel="http://schemas.microsoft.com/office/2019/extlst" xmlns:r="http://schemas.openxmlformats.org/officeDocument/2006/relationships" xmlns:m="http://schemas.openxmlformats.org/officeDocument/2006/math" xmlns:v="urn:schemas-microsoft-com:vml" xmlns:wp14="http://schemas.microsoft.com/office/word/2010/wordprocessingDrawing" xmlns:wp="http://schemas.openxmlformats.org/drawingml/2006/wordprocessingDrawing" xmlns:w10="urn:schemas-microsoft-com:office:word" xmlns:w="http://schemas.openxmlformats.org/wordprocessingml/2006/main" xmlns:w14="http://schemas.microsoft.com/office/word/2010/wordml" xmlns:w15="http://schemas.microsoft.com/office/word/2012/wordml" xmlns:w16cex="http://schemas.microsoft.com/office/word/2018/wordml/cex" xmlns:w16cid="http://schemas.microsoft.com/office/word/2016/wordml/cid" xmlns:w16="http://schemas.microsoft.com/office/word/2018/wordml" xmlns:w16du="http://schemas.microsoft.com/office/word/2023/wordml/word16du" xmlns:w16sdtdh="http://schemas.microsoft.com/office/word/2020/wordml/sdtdatahash" xmlns:w16sdtfl="http://schemas.microsoft.com/office/word/2024/wordml/sdtformatlock" xmlns:w16se="http://schemas.microsoft.com/office/word/2015/wordml/symex" xmlns:wpg="http://schemas.microsoft.com/office/word/2010/wordprocessingGroup" xmlns:wpi="http://schemas.microsoft.com/office/word/2010/wordprocessingInk" xmlns:wne="http://schemas.microsoft.com/office/word/2006/wordml" xmlns:wps="http://schemas.microsoft.com/office/word/2010/wordprocessingShape" mc:Ignorable="w14 w15 w16se w16cid w16 w16cex w16sdtdh w16sdtfl w16du wp14">
+<w:document xmlns:wpc="http://schemas.microsoft.com/office/word/2010/wordprocessingCanvas" xmlns:cx="http://schemas.microsoft.com/office/drawing/2014/chartex" xmlns:cx1="http://schemas.microsoft.com/office/drawing/2015/9/8/chartex" xmlns:cx2="http://schemas.microsoft.com/office/drawing/2015/10/21/chartex" xmlns:cx3="http://schemas.microsoft.com/office/drawing/2016/5/9/chartex" xmlns:cx4="http://schemas.microsoft.com/office/drawing/2016/5/10/chartex" xmlns:cx5="http://schemas.microsoft.com/office/drawing/2016/5/11/chartex" xmlns:cx6="http://schemas.microsoft.com/office/drawing/2016/5/12/chartex" xmlns:cx7="http://schemas.microsoft.com/office/drawing/2016/5/13/chartex" xmlns:cx8="http://schemas.microsoft.com/office/drawing/2016/5/14/chartex" xmlns:mc="http://schemas.openxmlformats.org/markup-compatibility/2006" xmlns:m="http://schemas.openxmlformats.org/officeDocument/2006/math" xmlns:aink="http://schemas.microsoft.com/office/drawing/2016/ink" xmlns:am3d="http://schemas.microsoft.com/office/drawing/2017/model3d" xmlns:oel="http://schemas.microsoft.com/office/2019/extlst" xmlns:r="http://schemas.openxmlformats.org/officeDocument/2006/relationships" xmlns:wp14="http://schemas.microsoft.com/office/word/2010/wordprocessingDrawing" xmlns:wp="http://schemas.openxmlformats.org/drawingml/2006/wordprocessingDrawing" xmlns:wpg="http://schemas.microsoft.com/office/word/2010/wordprocessingGroup" xmlns:wpi="http://schemas.microsoft.com/office/word/2010/wordprocessingInk" xmlns:wps="http://schemas.microsoft.com/office/word/2010/wordprocessingShape" xmlns:o="urn:schemas-microsoft-com:office:office" xmlns:v="urn:schemas-microsoft-com:vml" xmlns:w10="urn:schemas-microsoft-com:office:word" xmlns:w="http://schemas.openxmlformats.org/wordprocessingml/2006/main" xmlns:w14="http://schemas.microsoft.com/office/word/2010/wordml" xmlns:w15="http://schemas.microsoft.com/office/word/2012/wordml" xmlns:w16cex="http://schemas.microsoft.com/office/word/2018/wordml/cex" xmlns:w16cid="http://schemas.microsoft.com/office/word/2016/wordml/cid" xmlns:w16="http://schemas.microsoft.com/office/word/2018/wordml" xmlns:w16sdtdh="http://schemas.microsoft.com/office/word/2020/wordml/sdtdatahash" xmlns:w16sdtfl="http://schemas.microsoft.com/office/word/2024/wordml/sdtformatlock" xmlns:w16se="http://schemas.microsoft.com/office/word/2015/wordml/symex" xmlns:w16du="http://schemas.microsoft.com/office/word/2023/wordml/word16du" xmlns:wne="http://schemas.microsoft.com/office/word/2006/wordml" mc:Ignorable="w14 w15 w16se w16cid w16 w16cex w16sdtdh w16sdtfl w16du wp14">
   <w:body>
     <w:p>
       <w:pPr>
@@ -77,15 +77,7 @@
         <w:jc w:val="center"/>
       </w:pPr>
       <w:r>
-        <w:t xml:space="preserve">The </w:t>
-      </w:r>
-      <w:proofErr w:type="spellStart"/>
-      <w:r>
-        <w:t>University</w:t>
-      </w:r>
-      <w:proofErr w:type="spellEnd"/>
-      <w:r>
-        <w:t xml:space="preserve"> of Hong Kong</w:t>
+        <w:t>The University of Hong Kong</w:t>
       </w:r>
       <w:r>
         <w:t xml:space="preserve"> </w:t>
@@ -131,37 +123,6 @@
             <w:lang w:eastAsia="zh-CN"/>
           </w:rPr>
           <w:t>happinesslzcq@gmail.com</w:t>
-        </w:r>
-        <w:r>
-          <w:rPr>
-            <w:rStyle w:val="a9"/>
-            <w:bCs/>
-            <w:sz w:val="24"/>
-            <w:szCs w:val="24"/>
-            <w:lang w:eastAsia="zh-CN"/>
-          </w:rPr>
-          <w:t/>
-        </w:r>
-        <w:r>
-          <w:rPr>
-            <w:rStyle w:val="a9"/>
-            <w:rFonts w:hint="eastAsia"/>
-            <w:bCs/>
-            <w:sz w:val="24"/>
-            <w:szCs w:val="24"/>
-            <w:lang w:eastAsia="zh-CN"/>
-          </w:rPr>
-          <w:t/>
-        </w:r>
-        <w:r>
-          <w:rPr>
-            <w:rStyle w:val="a9"/>
-            <w:bCs/>
-            <w:sz w:val="24"/>
-            <w:szCs w:val="24"/>
-            <w:lang w:eastAsia="zh-CN"/>
-          </w:rPr>
-          <w:t/>
         </w:r>
       </w:hyperlink>
       <w:r>
@@ -693,11 +654,31 @@
       <w:r>
         <w:rPr>
           <w:b/>
+          <w:color w:val="FF0000"/>
           <w:sz w:val="22"/>
           <w:szCs w:val="22"/>
+        </w:rPr>
+        <w:t>2,60</w:t>
+      </w:r>
+      <w:r>
+        <w:rPr>
+          <w:rFonts w:hint="eastAsia"/>
+          <w:b/>
           <w:color w:val="FF0000"/>
-        </w:rPr>
-        <w:t>2,603 citations</w:t>
+          <w:sz w:val="22"/>
+          <w:szCs w:val="22"/>
+          <w:lang w:eastAsia="zh-CN"/>
+        </w:rPr>
+        <w:t>0</w:t>
+      </w:r>
+      <w:r>
+        <w:rPr>
+          <w:b/>
+          <w:color w:val="FF0000"/>
+          <w:sz w:val="22"/>
+          <w:szCs w:val="22"/>
+        </w:rPr>
+        <w:t xml:space="preserve"> citations</w:t>
       </w:r>
       <w:r>
         <w:rPr>
@@ -949,10 +930,10 @@
       </w:r>
       <w:r>
         <w:rPr>
+          <w:rFonts w:ascii="Arial Unicode MS" w:eastAsia="Arial Unicode MS" w:hAnsi="Arial Unicode MS" w:cs="Arial Unicode MS"/>
           <w:b w:val="0"/>
           <w:i/>
           <w:color w:val="0070C0"/>
-          <w:rFonts w:ascii="Arial Unicode MS" w:hAnsi="Arial Unicode MS" w:eastAsia="Arial Unicode MS" w:cs="Arial Unicode MS"/>
         </w:rPr>
         <w:t>✉</w:t>
       </w:r>
@@ -1001,28 +982,7 @@
         <w:t>Zhe Liu</w:t>
       </w:r>
       <w:r>
-        <w:t xml:space="preserve">, </w:t>
-      </w:r>
-      <w:r>
-        <w:rPr>
-          <w:b w:val="0"/>
-        </w:rPr>
-        <w:t>Tengteng Huang</w:t>
-      </w:r>
-      <w:r>
-        <w:t xml:space="preserve">, </w:t>
-      </w:r>
-      <w:r>
-        <w:rPr>
-          <w:b w:val="0"/>
-        </w:rPr>
-        <w:t>Bingling Li</w:t>
-      </w:r>
-      <w:r>
-        <w:t xml:space="preserve">, et al. </w:t>
-      </w:r>
-      <w:r>
-        <w:t xml:space="preserve">EPNet++: Cascade Bi-directional Fusion for Multi-Modal 3D Object Detection. </w:t>
+        <w:t xml:space="preserve">, Tengteng Huang, Bingling Li, et al. EPNet++: Cascade Bi-directional Fusion for Multi-Modal 3D Object Detection. </w:t>
       </w:r>
       <w:r>
         <w:rPr>
@@ -1051,28 +1011,7 @@
         <w:t>Zhe Liu</w:t>
       </w:r>
       <w:r>
-        <w:t xml:space="preserve">, </w:t>
-      </w:r>
-      <w:r>
-        <w:rPr>
-          <w:b w:val="0"/>
-        </w:rPr>
-        <w:t>Xin Zhao</w:t>
-      </w:r>
-      <w:r>
-        <w:t xml:space="preserve">, </w:t>
-      </w:r>
-      <w:r>
-        <w:rPr>
-          <w:b w:val="0"/>
-        </w:rPr>
-        <w:t>Tengteng Huang</w:t>
-      </w:r>
-      <w:r>
-        <w:t xml:space="preserve">, et al. </w:t>
-      </w:r>
-      <w:r>
-        <w:t xml:space="preserve">TANet: Robust 3D Object Detection from Point Clouds with Triple Attention. </w:t>
+        <w:t xml:space="preserve">, Xin Zhao, Tengteng Huang, et al. TANet: Robust 3D Object Detection from Point Clouds with Triple Attention. </w:t>
       </w:r>
       <w:r>
         <w:rPr>
@@ -1102,14 +1041,10 @@
         </w:rPr>
       </w:pPr>
       <w:r>
-        <w:rPr>
-          <w:b w:val="0"/>
-        </w:rPr>
         <w:t>Tengteng Huang</w:t>
       </w:r>
       <w:r>
         <w:rPr>
-          <w:b w:val="0"/>
           <w:vertAlign w:val="superscript"/>
         </w:rPr>
         <w:t>*</w:t>
@@ -1131,28 +1066,7 @@
         <w:t>*</w:t>
       </w:r>
       <w:r>
-        <w:t xml:space="preserve">, </w:t>
-      </w:r>
-      <w:r>
-        <w:rPr>
-          <w:b w:val="0"/>
-        </w:rPr>
-        <w:t>Xiwu Chen</w:t>
-      </w:r>
-      <w:r>
-        <w:t xml:space="preserve">, </w:t>
-      </w:r>
-      <w:r>
-        <w:rPr>
-          <w:b w:val="0"/>
-        </w:rPr>
-        <w:t>Xiang Bai</w:t>
-      </w:r>
-      <w:r>
-        <w:t xml:space="preserve">. </w:t>
-      </w:r>
-      <w:r>
-        <w:t xml:space="preserve">EPNet: Enhancing Point Features with Image Semantics for 3D Object Detection. </w:t>
+        <w:t xml:space="preserve">, Xiwu Chen, Xiang Bai. EPNet: Enhancing Point Features with Image Semantics for 3D Object Detection. </w:t>
       </w:r>
       <w:r>
         <w:rPr>
@@ -1188,35 +1102,16 @@
         <w:t>*</w:t>
       </w:r>
       <w:r>
-        <w:t xml:space="preserve">, </w:t>
-      </w:r>
-      <w:r>
-        <w:rPr>
-          <w:b w:val="0"/>
-        </w:rPr>
-        <w:t>Jinghua Hou</w:t>
-      </w:r>
-      <w:r>
-        <w:rPr>
-          <w:b w:val="0"/>
+        <w:t>, Jinghua Hou</w:t>
+      </w:r>
+      <w:r>
+        <w:rPr>
           <w:vertAlign w:val="superscript"/>
         </w:rPr>
         <w:t>*</w:t>
       </w:r>
       <w:r>
-        <w:t xml:space="preserve">, </w:t>
-      </w:r>
-      <w:r>
-        <w:rPr>
-          <w:b w:val="0"/>
-        </w:rPr>
-        <w:t>Xingyu Wang</w:t>
-      </w:r>
-      <w:r>
-        <w:t xml:space="preserve">, et al. </w:t>
-      </w:r>
-      <w:r>
-        <w:t xml:space="preserve">LION: Linear Group RNN for 3D Object Detection in Point Clouds. </w:t>
+        <w:t xml:space="preserve">, Xingyu Wang, et al. LION: Linear Group RNN for 3D Object Detection in Point Clouds. </w:t>
       </w:r>
       <w:r>
         <w:rPr>
@@ -1277,35 +1172,16 @@
         <w:t>*</w:t>
       </w:r>
       <w:r>
-        <w:t xml:space="preserve">, </w:t>
-      </w:r>
-      <w:r>
-        <w:rPr>
-          <w:b w:val="0"/>
-        </w:rPr>
-        <w:t>Jinghua Hou</w:t>
-      </w:r>
-      <w:r>
-        <w:rPr>
-          <w:b w:val="0"/>
+        <w:t>, Jinghua Hou</w:t>
+      </w:r>
+      <w:r>
+        <w:rPr>
           <w:vertAlign w:val="superscript"/>
         </w:rPr>
         <w:t>*</w:t>
       </w:r>
       <w:r>
-        <w:t xml:space="preserve">, </w:t>
-      </w:r>
-      <w:r>
-        <w:rPr>
-          <w:b w:val="0"/>
-        </w:rPr>
-        <w:t>Yuxiang Lu</w:t>
-      </w:r>
-      <w:r>
-        <w:t xml:space="preserve">, et al. </w:t>
-      </w:r>
-      <w:r>
-        <w:t xml:space="preserve">StreamPI: Streaming Multimodal Temporal Modeling for Vision-Language-Action Models. </w:t>
+        <w:t xml:space="preserve">, Yuxiang Lu, et al. StreamPI: Streaming Multimodal Temporal Modeling for Vision-Language-Action Models. </w:t>
       </w:r>
       <w:r>
         <w:rPr>
@@ -1329,13 +1205,7 @@
         </w:rPr>
       </w:pPr>
       <w:r>
-        <w:rPr>
-          <w:b w:val="0"/>
-        </w:rPr>
-        <w:t>Yuxiang Lu</w:t>
-      </w:r>
-      <w:r>
-        <w:t xml:space="preserve">, </w:t>
+        <w:t xml:space="preserve">Yuxiang Lu, </w:t>
       </w:r>
       <w:r>
         <w:rPr>
@@ -1351,19 +1221,7 @@
         <w:t>†</w:t>
       </w:r>
       <w:r>
-        <w:t xml:space="preserve">, </w:t>
-      </w:r>
-      <w:r>
-        <w:rPr>
-          <w:b w:val="0"/>
-        </w:rPr>
-        <w:t>Xianzhe Fan</w:t>
-      </w:r>
-      <w:r>
-        <w:t xml:space="preserve">, et al. </w:t>
-      </w:r>
-      <w:r>
-        <w:t xml:space="preserve">FASTER: Rethinking Real-Time Flow VLAs. </w:t>
+        <w:t xml:space="preserve">, Xianzhe Fan, et al. FASTER: Rethinking Real-Time Flow VLAs. </w:t>
       </w:r>
       <w:r>
         <w:rPr>
@@ -1387,13 +1245,7 @@
         </w:rPr>
       </w:pPr>
       <w:r>
-        <w:rPr>
-          <w:b w:val="0"/>
-        </w:rPr>
-        <w:t>Xirui Li</w:t>
-      </w:r>
-      <w:r>
-        <w:t xml:space="preserve">, </w:t>
+        <w:t xml:space="preserve">Xirui Li, </w:t>
       </w:r>
       <w:r>
         <w:rPr>
@@ -1409,27 +1261,17 @@
         <w:t>†</w:t>
       </w:r>
       <w:r>
-        <w:t xml:space="preserve">, </w:t>
-      </w:r>
-      <w:r>
-        <w:rPr>
-          <w:b w:val="0"/>
-        </w:rPr>
-        <w:t>Xiaoqing Ye</w:t>
-      </w:r>
-      <w:r>
-        <w:rPr>
-          <w:b w:val="0"/>
+        <w:t>, Xiaoqing Ye</w:t>
+      </w:r>
+      <w:r>
+        <w:rPr>
+          <w:rFonts w:ascii="Arial Unicode MS" w:eastAsia="Arial Unicode MS" w:hAnsi="Arial Unicode MS" w:cs="Arial Unicode MS"/>
           <w:vertAlign w:val="superscript"/>
-          <w:rFonts w:ascii="Arial Unicode MS" w:hAnsi="Arial Unicode MS" w:eastAsia="Arial Unicode MS" w:cs="Arial Unicode MS"/>
         </w:rPr>
         <w:t>✉</w:t>
       </w:r>
       <w:r>
-        <w:t xml:space="preserve">, et al. </w:t>
-      </w:r>
-      <w:r>
-        <w:t xml:space="preserve">FlowR2A: Learning Reward-to-Action Distribution for Multimodal Driving Planning. </w:t>
+        <w:t xml:space="preserve">, et al. FlowR2A: Learning Reward-to-Action Distribution for Multimodal Driving Planning. </w:t>
       </w:r>
       <w:r>
         <w:rPr>
@@ -1453,40 +1295,8 @@
         </w:rPr>
       </w:pPr>
       <w:r>
-        <w:rPr>
-          <w:b w:val="0"/>
-        </w:rPr>
-        <w:t>Junwei Luo</w:t>
-      </w:r>
-      <w:r>
-        <w:t xml:space="preserve">, </w:t>
-      </w:r>
-      <w:r>
-        <w:rPr>
-          <w:b w:val="0"/>
-        </w:rPr>
-        <w:t>Shuai Yuan</w:t>
-      </w:r>
-      <w:r>
-        <w:t xml:space="preserve">, </w:t>
-      </w:r>
-      <w:r>
-        <w:rPr>
-          <w:b w:val="0"/>
-        </w:rPr>
-        <w:t>Zhenya Yang</w:t>
-      </w:r>
-      <w:r>
-        <w:t xml:space="preserve">, </w:t>
-      </w:r>
-      <w:r>
-        <w:rPr>
-          <w:b w:val="0"/>
-        </w:rPr>
-        <w:t>Yansheng Li</w:t>
-      </w:r>
-      <w:r>
-        <w:t xml:space="preserve">, </w:t>
+        <w:lastRenderedPageBreak/>
+        <w:t xml:space="preserve">Junwei Luo, Shuai Yuan, Zhenya Yang, Yansheng Li, </w:t>
       </w:r>
       <w:r>
         <w:rPr>
@@ -1495,19 +1305,7 @@
         <w:t>Zhe Liu</w:t>
       </w:r>
       <w:r>
-        <w:t xml:space="preserve">, </w:t>
-      </w:r>
-      <w:r>
-        <w:rPr>
-          <w:b w:val="0"/>
-        </w:rPr>
-        <w:t>Hengshuang Zhao</w:t>
-      </w:r>
-      <w:r>
-        <w:t xml:space="preserve">. </w:t>
-      </w:r>
-      <w:r>
-        <w:t xml:space="preserve">EO-WM: A Physically Informed World Model for Probabilistic Earth Observation Forecasting. </w:t>
+        <w:t xml:space="preserve">, Hengshuang Zhao. EO-WM: A Physically Informed World Model for Probabilistic Earth Observation Forecasting. </w:t>
       </w:r>
       <w:r>
         <w:rPr>
@@ -1531,22 +1329,7 @@
         </w:rPr>
       </w:pPr>
       <w:r>
-        <w:rPr>
-          <w:b w:val="0"/>
-        </w:rPr>
-        <w:t>Runhui Huang</w:t>
-      </w:r>
-      <w:r>
-        <w:t xml:space="preserve">, </w:t>
-      </w:r>
-      <w:r>
-        <w:rPr>
-          <w:b w:val="0"/>
-        </w:rPr>
-        <w:t>Qihui Zhang</w:t>
-      </w:r>
-      <w:r>
-        <w:t xml:space="preserve">, </w:t>
+        <w:t xml:space="preserve">Runhui Huang, Qihui Zhang, </w:t>
       </w:r>
       <w:r>
         <w:rPr>
@@ -1555,10 +1338,7 @@
         <w:t>Zhe Liu</w:t>
       </w:r>
       <w:r>
-        <w:t xml:space="preserve">, et al. </w:t>
-      </w:r>
-      <w:r>
-        <w:t xml:space="preserve">Read It Back: Pretrained MLLMs Are Zero-Shot Reward Models for Text-to-Image Generation. </w:t>
+        <w:t xml:space="preserve">, et al. Read It Back: Pretrained MLLMs Are Zero-Shot Reward Models for Text-to-Image Generation. </w:t>
       </w:r>
       <w:r>
         <w:rPr>
@@ -1589,22 +1369,7 @@
         </w:rPr>
       </w:pPr>
       <w:r>
-        <w:rPr>
-          <w:b w:val="0"/>
-        </w:rPr>
-        <w:t>Ruihua Han</w:t>
-      </w:r>
-      <w:r>
-        <w:t xml:space="preserve">, </w:t>
-      </w:r>
-      <w:r>
-        <w:rPr>
-          <w:b w:val="0"/>
-        </w:rPr>
-        <w:t>Rui Gao</w:t>
-      </w:r>
-      <w:r>
-        <w:t xml:space="preserve">, </w:t>
+        <w:t xml:space="preserve">Ruihua Han, Rui Gao, </w:t>
       </w:r>
       <w:r>
         <w:rPr>
@@ -1613,10 +1378,7 @@
         <w:t>Zhe Liu</w:t>
       </w:r>
       <w:r>
-        <w:t xml:space="preserve">, et al. </w:t>
-      </w:r>
-      <w:r>
-        <w:t xml:space="preserve">SRL-MPC: Shape-Aware Reinforcement Learned Model Predictive Control. </w:t>
+        <w:t xml:space="preserve">, et al. SRL-MPC: Shape-Aware Reinforcement Learned Model Predictive Control. </w:t>
       </w:r>
       <w:r>
         <w:rPr>
@@ -1646,28 +1408,7 @@
         <w:t>Zhe Liu</w:t>
       </w:r>
       <w:r>
-        <w:t xml:space="preserve">, </w:t>
-      </w:r>
-      <w:r>
-        <w:rPr>
-          <w:b w:val="0"/>
-        </w:rPr>
-        <w:t>Runhui Huang</w:t>
-      </w:r>
-      <w:r>
-        <w:t xml:space="preserve">, </w:t>
-      </w:r>
-      <w:r>
-        <w:rPr>
-          <w:b w:val="0"/>
-        </w:rPr>
-        <w:t>Rui Yang</w:t>
-      </w:r>
-      <w:r>
-        <w:t xml:space="preserve">, et al. </w:t>
-      </w:r>
-      <w:r>
-        <w:t xml:space="preserve">DrivePI: Spatial-aware 4D MLLM for Unified Autonomous Driving Understanding, Perception, Prediction and Planning. </w:t>
+        <w:t xml:space="preserve">, Runhui Huang, Rui Yang, et al. DrivePI: Spatial-aware 4D MLLM for Unified Autonomous Driving Understanding, Perception, Prediction and Planning. </w:t>
       </w:r>
       <w:r>
         <w:rPr>
@@ -1691,13 +1432,7 @@
         </w:rPr>
       </w:pPr>
       <w:r>
-        <w:rPr>
-          <w:b w:val="0"/>
-        </w:rPr>
-        <w:t>Zhenya Yang</w:t>
-      </w:r>
-      <w:r>
-        <w:t xml:space="preserve">, </w:t>
+        <w:t xml:space="preserve">Zhenya Yang, </w:t>
       </w:r>
       <w:r>
         <w:rPr>
@@ -1713,19 +1448,7 @@
         <w:t>†</w:t>
       </w:r>
       <w:r>
-        <w:t xml:space="preserve">, </w:t>
-      </w:r>
-      <w:r>
-        <w:rPr>
-          <w:b w:val="0"/>
-        </w:rPr>
-        <w:t>Yuxiang Lu</w:t>
-      </w:r>
-      <w:r>
-        <w:t xml:space="preserve">, et al. </w:t>
-      </w:r>
-      <w:r>
-        <w:t xml:space="preserve">GenieDrive: Towards Physics-Aware Driving World Model with 4D Occupancy Guided Video Generation. </w:t>
+        <w:t xml:space="preserve">, Yuxiang Lu, et al. GenieDrive: Towards Physics-Aware Driving World Model with 4D Occupancy Guided Video Generation. </w:t>
       </w:r>
       <w:r>
         <w:rPr>
@@ -1749,31 +1472,7 @@
         </w:rPr>
       </w:pPr>
       <w:r>
-        <w:rPr>
-          <w:b w:val="0"/>
-        </w:rPr>
-        <w:t>Runhui Huang</w:t>
-      </w:r>
-      <w:r>
-        <w:t xml:space="preserve">, </w:t>
-      </w:r>
-      <w:r>
-        <w:rPr>
-          <w:b w:val="0"/>
-        </w:rPr>
-        <w:t>Jie Wu</w:t>
-      </w:r>
-      <w:r>
-        <w:t xml:space="preserve">, </w:t>
-      </w:r>
-      <w:r>
-        <w:rPr>
-          <w:b w:val="0"/>
-        </w:rPr>
-        <w:t>Rui Yang</w:t>
-      </w:r>
-      <w:r>
-        <w:t xml:space="preserve">, </w:t>
+        <w:t xml:space="preserve">Runhui Huang, Jie Wu, Rui Yang, </w:t>
       </w:r>
       <w:r>
         <w:rPr>
@@ -1782,19 +1481,7 @@
         <w:t>Zhe Liu</w:t>
       </w:r>
       <w:r>
-        <w:t xml:space="preserve">, </w:t>
-      </w:r>
-      <w:r>
-        <w:rPr>
-          <w:b w:val="0"/>
-        </w:rPr>
-        <w:t>Hengshuang Zhao</w:t>
-      </w:r>
-      <w:r>
-        <w:t xml:space="preserve">. </w:t>
-      </w:r>
-      <w:r>
-        <w:t xml:space="preserve">AlphaGRPO: Unlocking Self-Reflective Multimodal Generation in UMMs via Decompositional Verifiable Reward. </w:t>
+        <w:t xml:space="preserve">, Hengshuang Zhao. AlphaGRPO: Unlocking Self-Reflective Multimodal Generation in UMMs via Decompositional Verifiable Reward. </w:t>
       </w:r>
       <w:r>
         <w:rPr>
@@ -1818,14 +1505,10 @@
         </w:rPr>
       </w:pPr>
       <w:r>
-        <w:rPr>
-          <w:b w:val="0"/>
-        </w:rPr>
         <w:t>Shijun Shi</w:t>
       </w:r>
       <w:r>
         <w:rPr>
-          <w:b w:val="0"/>
           <w:vertAlign w:val="superscript"/>
         </w:rPr>
         <w:t>*</w:t>
@@ -1847,19 +1530,7 @@
         <w:t>*</w:t>
       </w:r>
       <w:r>
-        <w:t xml:space="preserve">, </w:t>
-      </w:r>
-      <w:r>
-        <w:rPr>
-          <w:b w:val="0"/>
-        </w:rPr>
-        <w:t>Zhi Hou</w:t>
-      </w:r>
-      <w:r>
-        <w:t xml:space="preserve">, et al. </w:t>
-      </w:r>
-      <w:r>
-        <w:t xml:space="preserve">Atomic-WAM: Execution-Grounded Atomic-Motion Reasoning for World Action Models. </w:t>
+        <w:t xml:space="preserve">, Zhi Hou, et al. Atomic-WAM: Execution-Grounded Atomic-Motion Reasoning for World Action Models. </w:t>
       </w:r>
       <w:r>
         <w:rPr>
@@ -1883,13 +1554,7 @@
         </w:rPr>
       </w:pPr>
       <w:r>
-        <w:rPr>
-          <w:b w:val="0"/>
-        </w:rPr>
-        <w:t>Jinghua Hou</w:t>
-      </w:r>
-      <w:r>
-        <w:t xml:space="preserve">, </w:t>
+        <w:t xml:space="preserve">Jinghua Hou, </w:t>
       </w:r>
       <w:r>
         <w:rPr>
@@ -1905,27 +1570,17 @@
         <w:t>†</w:t>
       </w:r>
       <w:r>
-        <w:t xml:space="preserve">, </w:t>
-      </w:r>
-      <w:r>
-        <w:rPr>
-          <w:b w:val="0"/>
-        </w:rPr>
-        <w:t>Hengshuang Zhao</w:t>
-      </w:r>
-      <w:r>
-        <w:rPr>
-          <w:b w:val="0"/>
+        <w:t>, Hengshuang Zhao</w:t>
+      </w:r>
+      <w:r>
+        <w:rPr>
+          <w:rFonts w:ascii="Arial Unicode MS" w:eastAsia="Arial Unicode MS" w:hAnsi="Arial Unicode MS" w:cs="Arial Unicode MS"/>
           <w:vertAlign w:val="superscript"/>
-          <w:rFonts w:ascii="Arial Unicode MS" w:hAnsi="Arial Unicode MS" w:eastAsia="Arial Unicode MS" w:cs="Arial Unicode MS"/>
         </w:rPr>
         <w:t>✉</w:t>
       </w:r>
       <w:r>
-        <w:t xml:space="preserve">. </w:t>
-      </w:r>
-      <w:r>
-        <w:t xml:space="preserve">DVD: Dynamic Vector Decoding for Efficient MLLM-based Perception. </w:t>
+        <w:t xml:space="preserve">. DVD: Dynamic Vector Decoding for Efficient MLLM-based Perception. </w:t>
       </w:r>
       <w:r>
         <w:rPr>
@@ -2244,18 +1899,8 @@
           <w:bCs/>
           <w:szCs w:val="21"/>
         </w:rPr>
-        <w:t>(</w:t>
-      </w:r>
-      <w:proofErr w:type="spellStart"/>
-      <w:r>
-        <w:rPr>
-          <w:b/>
-          <w:bCs/>
-          <w:szCs w:val="21"/>
-        </w:rPr>
-        <w:t>Chinese</w:t>
-      </w:r>
-      <w:proofErr w:type="spellEnd"/>
+        <w:t>(Chinese</w:t>
+      </w:r>
       <w:r>
         <w:rPr>
           <w:b/>
@@ -2391,18 +2036,8 @@
           <w:bCs/>
           <w:szCs w:val="21"/>
         </w:rPr>
-        <w:t>(</w:t>
-      </w:r>
-      <w:proofErr w:type="spellStart"/>
-      <w:r>
-        <w:rPr>
-          <w:b/>
-          <w:bCs/>
-          <w:szCs w:val="21"/>
-        </w:rPr>
-        <w:t>Chinese</w:t>
-      </w:r>
-      <w:proofErr w:type="spellEnd"/>
+        <w:t>(Chinese</w:t>
+      </w:r>
       <w:r>
         <w:rPr>
           <w:b/>
@@ -2529,18 +2164,8 @@
           <w:bCs/>
           <w:szCs w:val="21"/>
         </w:rPr>
-        <w:t>(</w:t>
-      </w:r>
-      <w:proofErr w:type="spellStart"/>
-      <w:r>
-        <w:rPr>
-          <w:b/>
-          <w:bCs/>
-          <w:szCs w:val="21"/>
-        </w:rPr>
-        <w:t>Chinese</w:t>
-      </w:r>
-      <w:proofErr w:type="spellEnd"/>
+        <w:t>(Chinese</w:t>
+      </w:r>
       <w:r>
         <w:rPr>
           <w:b/>
@@ -2875,7 +2500,7 @@
 </file>
 
 <file path=word/endnotes.xml><?xml version="1.0" encoding="utf-8"?>
-<w:endnotes xmlns:wpc="http://schemas.microsoft.com/office/word/2010/wordprocessingCanvas" xmlns:cx="http://schemas.microsoft.com/office/drawing/2014/chartex" xmlns:cx1="http://schemas.microsoft.com/office/drawing/2015/9/8/chartex" xmlns:cx2="http://schemas.microsoft.com/office/drawing/2015/10/21/chartex" xmlns:cx3="http://schemas.microsoft.com/office/drawing/2016/5/9/chartex" xmlns:cx4="http://schemas.microsoft.com/office/drawing/2016/5/10/chartex" xmlns:cx5="http://schemas.microsoft.com/office/drawing/2016/5/11/chartex" xmlns:cx6="http://schemas.microsoft.com/office/drawing/2016/5/12/chartex" xmlns:cx7="http://schemas.microsoft.com/office/drawing/2016/5/13/chartex" xmlns:cx8="http://schemas.microsoft.com/office/drawing/2016/5/14/chartex" xmlns:mc="http://schemas.openxmlformats.org/markup-compatibility/2006" xmlns:aink="http://schemas.microsoft.com/office/drawing/2016/ink" xmlns:am3d="http://schemas.microsoft.com/office/drawing/2017/model3d" xmlns:o="urn:schemas-microsoft-com:office:office" xmlns:oel="http://schemas.microsoft.com/office/2019/extlst" xmlns:r="http://schemas.openxmlformats.org/officeDocument/2006/relationships" xmlns:m="http://schemas.openxmlformats.org/officeDocument/2006/math" xmlns:v="urn:schemas-microsoft-com:vml" xmlns:wp14="http://schemas.microsoft.com/office/word/2010/wordprocessingDrawing" xmlns:wp="http://schemas.openxmlformats.org/drawingml/2006/wordprocessingDrawing" xmlns:w10="urn:schemas-microsoft-com:office:word" xmlns:w="http://schemas.openxmlformats.org/wordprocessingml/2006/main" xmlns:w14="http://schemas.microsoft.com/office/word/2010/wordml" xmlns:w15="http://schemas.microsoft.com/office/word/2012/wordml" xmlns:w16cex="http://schemas.microsoft.com/office/word/2018/wordml/cex" xmlns:w16cid="http://schemas.microsoft.com/office/word/2016/wordml/cid" xmlns:w16="http://schemas.microsoft.com/office/word/2018/wordml" xmlns:w16du="http://schemas.microsoft.com/office/word/2023/wordml/word16du" xmlns:w16sdtdh="http://schemas.microsoft.com/office/word/2020/wordml/sdtdatahash" xmlns:w16sdtfl="http://schemas.microsoft.com/office/word/2024/wordml/sdtformatlock" xmlns:w16se="http://schemas.microsoft.com/office/word/2015/wordml/symex" xmlns:wpg="http://schemas.microsoft.com/office/word/2010/wordprocessingGroup" xmlns:wpi="http://schemas.microsoft.com/office/word/2010/wordprocessingInk" xmlns:wne="http://schemas.microsoft.com/office/word/2006/wordml" xmlns:wps="http://schemas.microsoft.com/office/word/2010/wordprocessingShape" mc:Ignorable="w14 w15 w16se w16cid w16 w16cex w16sdtdh w16sdtfl w16du wp14">
+<w:endnotes xmlns:wpc="http://schemas.microsoft.com/office/word/2010/wordprocessingCanvas" xmlns:cx="http://schemas.microsoft.com/office/drawing/2014/chartex" xmlns:cx1="http://schemas.microsoft.com/office/drawing/2015/9/8/chartex" xmlns:cx2="http://schemas.microsoft.com/office/drawing/2015/10/21/chartex" xmlns:cx3="http://schemas.microsoft.com/office/drawing/2016/5/9/chartex" xmlns:cx4="http://schemas.microsoft.com/office/drawing/2016/5/10/chartex" xmlns:cx5="http://schemas.microsoft.com/office/drawing/2016/5/11/chartex" xmlns:cx6="http://schemas.microsoft.com/office/drawing/2016/5/12/chartex" xmlns:cx7="http://schemas.microsoft.com/office/drawing/2016/5/13/chartex" xmlns:cx8="http://schemas.microsoft.com/office/drawing/2016/5/14/chartex" xmlns:mc="http://schemas.openxmlformats.org/markup-compatibility/2006" xmlns:m="http://schemas.openxmlformats.org/officeDocument/2006/math" xmlns:aink="http://schemas.microsoft.com/office/drawing/2016/ink" xmlns:am3d="http://schemas.microsoft.com/office/drawing/2017/model3d" xmlns:oel="http://schemas.microsoft.com/office/2019/extlst" xmlns:r="http://schemas.openxmlformats.org/officeDocument/2006/relationships" xmlns:wp14="http://schemas.microsoft.com/office/word/2010/wordprocessingDrawing" xmlns:wp="http://schemas.openxmlformats.org/drawingml/2006/wordprocessingDrawing" xmlns:wpg="http://schemas.microsoft.com/office/word/2010/wordprocessingGroup" xmlns:wpi="http://schemas.microsoft.com/office/word/2010/wordprocessingInk" xmlns:wps="http://schemas.microsoft.com/office/word/2010/wordprocessingShape" xmlns:o="urn:schemas-microsoft-com:office:office" xmlns:v="urn:schemas-microsoft-com:vml" xmlns:w10="urn:schemas-microsoft-com:office:word" xmlns:w="http://schemas.openxmlformats.org/wordprocessingml/2006/main" xmlns:w14="http://schemas.microsoft.com/office/word/2010/wordml" xmlns:w15="http://schemas.microsoft.com/office/word/2012/wordml" xmlns:w16cex="http://schemas.microsoft.com/office/word/2018/wordml/cex" xmlns:w16cid="http://schemas.microsoft.com/office/word/2016/wordml/cid" xmlns:w16="http://schemas.microsoft.com/office/word/2018/wordml" xmlns:w16sdtdh="http://schemas.microsoft.com/office/word/2020/wordml/sdtdatahash" xmlns:w16sdtfl="http://schemas.microsoft.com/office/word/2024/wordml/sdtformatlock" xmlns:w16se="http://schemas.microsoft.com/office/word/2015/wordml/symex" xmlns:w16du="http://schemas.microsoft.com/office/word/2023/wordml/word16du" xmlns:wne="http://schemas.microsoft.com/office/word/2006/wordml" mc:Ignorable="w14 w15 w16se w16cid w16 w16cex w16sdtdh w16sdtfl w16du wp14">
   <w:endnote w:type="separator" w:id="-1">
     <w:p>
       <w:r>
@@ -2894,7 +2519,7 @@
 </file>
 
 <file path=word/footnotes.xml><?xml version="1.0" encoding="utf-8"?>
-<w:footnotes xmlns:wpc="http://schemas.microsoft.com/office/word/2010/wordprocessingCanvas" xmlns:cx="http://schemas.microsoft.com/office/drawing/2014/chartex" xmlns:cx1="http://schemas.microsoft.com/office/drawing/2015/9/8/chartex" xmlns:cx2="http://schemas.microsoft.com/office/drawing/2015/10/21/chartex" xmlns:cx3="http://schemas.microsoft.com/office/drawing/2016/5/9/chartex" xmlns:cx4="http://schemas.microsoft.com/office/drawing/2016/5/10/chartex" xmlns:cx5="http://schemas.microsoft.com/office/drawing/2016/5/11/chartex" xmlns:cx6="http://schemas.microsoft.com/office/drawing/2016/5/12/chartex" xmlns:cx7="http://schemas.microsoft.com/office/drawing/2016/5/13/chartex" xmlns:cx8="http://schemas.microsoft.com/office/drawing/2016/5/14/chartex" xmlns:mc="http://schemas.openxmlformats.org/markup-compatibility/2006" xmlns:aink="http://schemas.microsoft.com/office/drawing/2016/ink" xmlns:am3d="http://schemas.microsoft.com/office/drawing/2017/model3d" xmlns:o="urn:schemas-microsoft-com:office:office" xmlns:oel="http://schemas.microsoft.com/office/2019/extlst" xmlns:r="http://schemas.openxmlformats.org/officeDocument/2006/relationships" xmlns:m="http://schemas.openxmlformats.org/officeDocument/2006/math" xmlns:v="urn:schemas-microsoft-com:vml" xmlns:wp14="http://schemas.microsoft.com/office/word/2010/wordprocessingDrawing" xmlns:wp="http://schemas.openxmlformats.org/drawingml/2006/wordprocessingDrawing" xmlns:w10="urn:schemas-microsoft-com:office:word" xmlns:w="http://schemas.openxmlformats.org/wordprocessingml/2006/main" xmlns:w14="http://schemas.microsoft.com/office/word/2010/wordml" xmlns:w15="http://schemas.microsoft.com/office/word/2012/wordml" xmlns:w16cex="http://schemas.microsoft.com/office/word/2018/wordml/cex" xmlns:w16cid="http://schemas.microsoft.com/office/word/2016/wordml/cid" xmlns:w16="http://schemas.microsoft.com/office/word/2018/wordml" xmlns:w16du="http://schemas.microsoft.com/office/word/2023/wordml/word16du" xmlns:w16sdtdh="http://schemas.microsoft.com/office/word/2020/wordml/sdtdatahash" xmlns:w16sdtfl="http://schemas.microsoft.com/office/word/2024/wordml/sdtformatlock" xmlns:w16se="http://schemas.microsoft.com/office/word/2015/wordml/symex" xmlns:wpg="http://schemas.microsoft.com/office/word/2010/wordprocessingGroup" xmlns:wpi="http://schemas.microsoft.com/office/word/2010/wordprocessingInk" xmlns:wne="http://schemas.microsoft.com/office/word/2006/wordml" xmlns:wps="http://schemas.microsoft.com/office/word/2010/wordprocessingShape" mc:Ignorable="w14 w15 w16se w16cid w16 w16cex w16sdtdh w16sdtfl w16du wp14">
+<w:footnotes xmlns:wpc="http://schemas.microsoft.com/office/word/2010/wordprocessingCanvas" xmlns:cx="http://schemas.microsoft.com/office/drawing/2014/chartex" xmlns:cx1="http://schemas.microsoft.com/office/drawing/2015/9/8/chartex" xmlns:cx2="http://schemas.microsoft.com/office/drawing/2015/10/21/chartex" xmlns:cx3="http://schemas.microsoft.com/office/drawing/2016/5/9/chartex" xmlns:cx4="http://schemas.microsoft.com/office/drawing/2016/5/10/chartex" xmlns:cx5="http://schemas.microsoft.com/office/drawing/2016/5/11/chartex" xmlns:cx6="http://schemas.microsoft.com/office/drawing/2016/5/12/chartex" xmlns:cx7="http://schemas.microsoft.com/office/drawing/2016/5/13/chartex" xmlns:cx8="http://schemas.microsoft.com/office/drawing/2016/5/14/chartex" xmlns:mc="http://schemas.openxmlformats.org/markup-compatibility/2006" xmlns:m="http://schemas.openxmlformats.org/officeDocument/2006/math" xmlns:aink="http://schemas.microsoft.com/office/drawing/2016/ink" xmlns:am3d="http://schemas.microsoft.com/office/drawing/2017/model3d" xmlns:oel="http://schemas.microsoft.com/office/2019/extlst" xmlns:r="http://schemas.openxmlformats.org/officeDocument/2006/relationships" xmlns:wp14="http://schemas.microsoft.com/office/word/2010/wordprocessingDrawing" xmlns:wp="http://schemas.openxmlformats.org/drawingml/2006/wordprocessingDrawing" xmlns:wpg="http://schemas.microsoft.com/office/word/2010/wordprocessingGroup" xmlns:wpi="http://schemas.microsoft.com/office/word/2010/wordprocessingInk" xmlns:wps="http://schemas.microsoft.com/office/word/2010/wordprocessingShape" xmlns:o="urn:schemas-microsoft-com:office:office" xmlns:v="urn:schemas-microsoft-com:vml" xmlns:w10="urn:schemas-microsoft-com:office:word" xmlns:w="http://schemas.openxmlformats.org/wordprocessingml/2006/main" xmlns:w14="http://schemas.microsoft.com/office/word/2010/wordml" xmlns:w15="http://schemas.microsoft.com/office/word/2012/wordml" xmlns:w16cex="http://schemas.microsoft.com/office/word/2018/wordml/cex" xmlns:w16cid="http://schemas.microsoft.com/office/word/2016/wordml/cid" xmlns:w16="http://schemas.microsoft.com/office/word/2018/wordml" xmlns:w16sdtdh="http://schemas.microsoft.com/office/word/2020/wordml/sdtdatahash" xmlns:w16sdtfl="http://schemas.microsoft.com/office/word/2024/wordml/sdtformatlock" xmlns:w16se="http://schemas.microsoft.com/office/word/2015/wordml/symex" xmlns:w16du="http://schemas.microsoft.com/office/word/2023/wordml/word16du" xmlns:wne="http://schemas.microsoft.com/office/word/2006/wordml" mc:Ignorable="w14 w15 w16se w16cid w16 w16cex w16sdtdh w16sdtfl w16du wp14">
   <w:footnote w:type="separator" w:id="-1">
     <w:p>
       <w:r>
@@ -2913,7 +2538,7 @@
 </file>
 
 <file path=word/numbering.xml><?xml version="1.0" encoding="utf-8"?>
-<w:numbering xmlns:wpc="http://schemas.microsoft.com/office/word/2010/wordprocessingCanvas" xmlns:cx="http://schemas.microsoft.com/office/drawing/2014/chartex" xmlns:cx1="http://schemas.microsoft.com/office/drawing/2015/9/8/chartex" xmlns:cx2="http://schemas.microsoft.com/office/drawing/2015/10/21/chartex" xmlns:cx3="http://schemas.microsoft.com/office/drawing/2016/5/9/chartex" xmlns:cx4="http://schemas.microsoft.com/office/drawing/2016/5/10/chartex" xmlns:cx5="http://schemas.microsoft.com/office/drawing/2016/5/11/chartex" xmlns:cx6="http://schemas.microsoft.com/office/drawing/2016/5/12/chartex" xmlns:cx7="http://schemas.microsoft.com/office/drawing/2016/5/13/chartex" xmlns:cx8="http://schemas.microsoft.com/office/drawing/2016/5/14/chartex" xmlns:mc="http://schemas.openxmlformats.org/markup-compatibility/2006" xmlns:aink="http://schemas.microsoft.com/office/drawing/2016/ink" xmlns:am3d="http://schemas.microsoft.com/office/drawing/2017/model3d" xmlns:o="urn:schemas-microsoft-com:office:office" xmlns:oel="http://schemas.microsoft.com/office/2019/extlst" xmlns:r="http://schemas.openxmlformats.org/officeDocument/2006/relationships" xmlns:m="http://schemas.openxmlformats.org/officeDocument/2006/math" xmlns:v="urn:schemas-microsoft-com:vml" xmlns:wp14="http://schemas.microsoft.com/office/word/2010/wordprocessingDrawing" xmlns:wp="http://schemas.openxmlformats.org/drawingml/2006/wordprocessingDrawing" xmlns:w10="urn:schemas-microsoft-com:office:word" xmlns:w="http://schemas.openxmlformats.org/wordprocessingml/2006/main" xmlns:w14="http://schemas.microsoft.com/office/word/2010/wordml" xmlns:w15="http://schemas.microsoft.com/office/word/2012/wordml" xmlns:w16cex="http://schemas.microsoft.com/office/word/2018/wordml/cex" xmlns:w16cid="http://schemas.microsoft.com/office/word/2016/wordml/cid" xmlns:w16="http://schemas.microsoft.com/office/word/2018/wordml" xmlns:w16du="http://schemas.microsoft.com/office/word/2023/wordml/word16du" xmlns:w16sdtdh="http://schemas.microsoft.com/office/word/2020/wordml/sdtdatahash" xmlns:w16sdtfl="http://schemas.microsoft.com/office/word/2024/wordml/sdtformatlock" xmlns:w16se="http://schemas.microsoft.com/office/word/2015/wordml/symex" xmlns:wpg="http://schemas.microsoft.com/office/word/2010/wordprocessingGroup" xmlns:wpi="http://schemas.microsoft.com/office/word/2010/wordprocessingInk" xmlns:wne="http://schemas.microsoft.com/office/word/2006/wordml" xmlns:wps="http://schemas.microsoft.com/office/word/2010/wordprocessingShape" mc:Ignorable="w14 w15 w16se w16cid w16 w16cex w16sdtdh w16sdtfl w16du wp14">
+<w:numbering xmlns:wpc="http://schemas.microsoft.com/office/word/2010/wordprocessingCanvas" xmlns:cx="http://schemas.microsoft.com/office/drawing/2014/chartex" xmlns:cx1="http://schemas.microsoft.com/office/drawing/2015/9/8/chartex" xmlns:cx2="http://schemas.microsoft.com/office/drawing/2015/10/21/chartex" xmlns:cx3="http://schemas.microsoft.com/office/drawing/2016/5/9/chartex" xmlns:cx4="http://schemas.microsoft.com/office/drawing/2016/5/10/chartex" xmlns:cx5="http://schemas.microsoft.com/office/drawing/2016/5/11/chartex" xmlns:cx6="http://schemas.microsoft.com/office/drawing/2016/5/12/chartex" xmlns:cx7="http://schemas.microsoft.com/office/drawing/2016/5/13/chartex" xmlns:cx8="http://schemas.microsoft.com/office/drawing/2016/5/14/chartex" xmlns:mc="http://schemas.openxmlformats.org/markup-compatibility/2006" xmlns:m="http://schemas.openxmlformats.org/officeDocument/2006/math" xmlns:aink="http://schemas.microsoft.com/office/drawing/2016/ink" xmlns:am3d="http://schemas.microsoft.com/office/drawing/2017/model3d" xmlns:oel="http://schemas.microsoft.com/office/2019/extlst" xmlns:r="http://schemas.openxmlformats.org/officeDocument/2006/relationships" xmlns:wp14="http://schemas.microsoft.com/office/word/2010/wordprocessingDrawing" xmlns:wp="http://schemas.openxmlformats.org/drawingml/2006/wordprocessingDrawing" xmlns:wpg="http://schemas.microsoft.com/office/word/2010/wordprocessingGroup" xmlns:wpi="http://schemas.microsoft.com/office/word/2010/wordprocessingInk" xmlns:wps="http://schemas.microsoft.com/office/word/2010/wordprocessingShape" xmlns:o="urn:schemas-microsoft-com:office:office" xmlns:v="urn:schemas-microsoft-com:vml" xmlns:w10="urn:schemas-microsoft-com:office:word" xmlns:w="http://schemas.openxmlformats.org/wordprocessingml/2006/main" xmlns:w14="http://schemas.microsoft.com/office/word/2010/wordml" xmlns:w15="http://schemas.microsoft.com/office/word/2012/wordml" xmlns:w16cex="http://schemas.microsoft.com/office/word/2018/wordml/cex" xmlns:w16cid="http://schemas.microsoft.com/office/word/2016/wordml/cid" xmlns:w16="http://schemas.microsoft.com/office/word/2018/wordml" xmlns:w16sdtdh="http://schemas.microsoft.com/office/word/2020/wordml/sdtdatahash" xmlns:w16sdtfl="http://schemas.microsoft.com/office/word/2024/wordml/sdtformatlock" xmlns:w16se="http://schemas.microsoft.com/office/word/2015/wordml/symex" xmlns:w16du="http://schemas.microsoft.com/office/word/2023/wordml/word16du" xmlns:wne="http://schemas.microsoft.com/office/word/2006/wordml" mc:Ignorable="w14 w15 w16se w16cid w16 w16cex w16sdtdh w16sdtfl w16du wp14">
   <w:abstractNum w:abstractNumId="0" w15:restartNumberingAfterBreak="0">
     <w:nsid w:val="00B26036"/>
     <w:multiLevelType w:val="hybridMultilevel"/>
@@ -5675,7 +5300,7 @@
 </file>
 
 <file path=word/styles.xml><?xml version="1.0" encoding="utf-8"?>
-<w:styles xmlns:mc="http://schemas.openxmlformats.org/markup-compatibility/2006" xmlns:r="http://schemas.openxmlformats.org/officeDocument/2006/relationships" xmlns:w="http://schemas.openxmlformats.org/wordprocessingml/2006/main" xmlns:w14="http://schemas.microsoft.com/office/word/2010/wordml" xmlns:w15="http://schemas.microsoft.com/office/word/2012/wordml" xmlns:w16cex="http://schemas.microsoft.com/office/word/2018/wordml/cex" xmlns:w16cid="http://schemas.microsoft.com/office/word/2016/wordml/cid" xmlns:w16="http://schemas.microsoft.com/office/word/2018/wordml" xmlns:w16du="http://schemas.microsoft.com/office/word/2023/wordml/word16du" xmlns:w16sdtdh="http://schemas.microsoft.com/office/word/2020/wordml/sdtdatahash" xmlns:w16sdtfl="http://schemas.microsoft.com/office/word/2024/wordml/sdtformatlock" xmlns:w16se="http://schemas.microsoft.com/office/word/2015/wordml/symex" mc:Ignorable="w14 w15 w16se w16cid w16 w16cex w16sdtdh w16sdtfl w16du">
+<w:styles xmlns:mc="http://schemas.openxmlformats.org/markup-compatibility/2006" xmlns:r="http://schemas.openxmlformats.org/officeDocument/2006/relationships" xmlns:w="http://schemas.openxmlformats.org/wordprocessingml/2006/main" xmlns:w14="http://schemas.microsoft.com/office/word/2010/wordml" xmlns:w15="http://schemas.microsoft.com/office/word/2012/wordml" xmlns:w16cex="http://schemas.microsoft.com/office/word/2018/wordml/cex" xmlns:w16cid="http://schemas.microsoft.com/office/word/2016/wordml/cid" xmlns:w16="http://schemas.microsoft.com/office/word/2018/wordml" xmlns:w16sdtdh="http://schemas.microsoft.com/office/word/2020/wordml/sdtdatahash" xmlns:w16sdtfl="http://schemas.microsoft.com/office/word/2024/wordml/sdtformatlock" xmlns:w16se="http://schemas.microsoft.com/office/word/2015/wordml/symex" xmlns:w16du="http://schemas.microsoft.com/office/word/2023/wordml/word16du" mc:Ignorable="w14 w15 w16se w16cid w16 w16cex w16sdtdh w16sdtfl w16du">
   <w:docDefaults>
     <w:rPrDefault>
       <w:rPr>

</xml_diff>